<commit_message>
Update weekly report 10
</commit_message>
<xml_diff>
--- a/BaoCao/bao-cao-tuan/BaoCao_Tuan10.docx
+++ b/BaoCao/bao-cao-tuan/BaoCao_Tuan10.docx
@@ -283,6 +283,150 @@
           <w:p>
             <w:r>
               <w:t>-  Hiệu quả: chủ động khi xe cộ trục trặc, lễ tết quá tải, hoặc bảo trì hệ thống — không nhận thêm đơn online trong thời gian đó.</w:t>
+            </w:r>
+          </w:p>
+          <w:p>
+            <w:r>
+              <w:rPr>
+                <w:b/>
+              </w:rPr>
+              <w:t>Tài xế quét QR vé khách trên trang /driver</w:t>
+            </w:r>
+          </w:p>
+          <w:p>
+            <w:r>
+              <w:t>-  Tài xế mở /driver bằng điện thoại, quét QR trên vé khách → tự check-in, hiện tên + ghế + tuyến.</w:t>
+            </w:r>
+          </w:p>
+          <w:p>
+            <w:r>
+              <w:t>-  Hiệu quả: bỏ thao tác đối chiếu danh sách giấy, chống vé giả, thống kê khách lên xe chính xác theo từng chuyến.</w:t>
+            </w:r>
+          </w:p>
+          <w:p>
+            <w:r>
+              <w:rPr>
+                <w:b/>
+              </w:rPr>
+              <w:t>Tampermonkey đồng bộ O2BSoft → NhapHang</w:t>
+            </w:r>
+          </w:p>
+          <w:p>
+            <w:r>
+              <w:t>-  Userscript chạy ngầm trên trình duyệt, đọc bảng đơn O2BSoft mỗi 20s, tự POST sang NhapHang — bấm 1 nút Sync là kéo hết các trang.</w:t>
+            </w:r>
+          </w:p>
+          <w:p>
+            <w:r>
+              <w:t>-  Hiệu quả: nhân viên An Đông không phải gõ tay lại đơn, đồng bộ liên tục cả khi máy khoá màn hình.</w:t>
+            </w:r>
+          </w:p>
+          <w:p>
+            <w:r>
+              <w:rPr>
+                <w:b/>
+              </w:rPr>
+              <w:t>Webhook đồng bộ 2 chiều route TongHop ↔ DatVe</w:t>
+            </w:r>
+          </w:p>
+          <w:p>
+            <w:r>
+              <w:t>-  Sửa thông tin tuyến (giờ chạy, giá vé, điểm đón) ở 1 bên → bên kia tự cập nhật qua webhook /api/tong-hop/routes/by-datve/[id].</w:t>
+            </w:r>
+          </w:p>
+          <w:p>
+            <w:r>
+              <w:t>-  Hiệu quả: không phải sửa 2 nơi, không lệch dữ liệu giữa hệ thống quản lý và web khách hàng.</w:t>
+            </w:r>
+          </w:p>
+          <w:p>
+            <w:r>
+              <w:rPr>
+                <w:b/>
+              </w:rPr>
+              <w:t>Mã đơn NhapHang YYMMDD.SSNN sinh atomic</w:t>
+            </w:r>
+          </w:p>
+          <w:p>
+            <w:r>
+              <w:t>-  Mã đơn gồm ngày + mã trạm NHẬN + số thứ tự, server sinh qua atomic upsert bảng Counters → không bao giờ trùng.</w:t>
+            </w:r>
+          </w:p>
+          <w:p>
+            <w:r>
+              <w:t>-  Hiệu quả: 2 nhân viên cùng trạm nhập song song không sinh mã trùng, dễ tra cứu theo ngày + trạm.</w:t>
+            </w:r>
+          </w:p>
+          <w:p>
+            <w:r>
+              <w:rPr>
+                <w:b/>
+              </w:rPr>
+              <w:t>Audit log changedBy mỗi thao tác</w:t>
+            </w:r>
+          </w:p>
+          <w:p>
+            <w:r>
+              <w:t>-  Mỗi lần sửa/huỷ đơn lưu vào ProductLogs ai sửa, sửa gì, lúc nào, từ IP nào.</w:t>
+            </w:r>
+          </w:p>
+          <w:p>
+            <w:r>
+              <w:t>-  Hiệu quả: tra cứu được ai làm sai khi khách khiếu nại, giảm tranh cãi nội bộ, đối chiếu trách nhiệm rõ ràng.</w:t>
+            </w:r>
+          </w:p>
+          <w:p>
+            <w:r>
+              <w:rPr>
+                <w:b/>
+              </w:rPr>
+              <w:t>Mật khẩu cũ plain-text tự rehash bcrypt khi login</w:t>
+            </w:r>
+          </w:p>
+          <w:p>
+            <w:r>
+              <w:t>-  User cũ login lần đầu sau update → hệ thống tự đổi password sang bcrypt, không cần reset hàng loạt.</w:t>
+            </w:r>
+          </w:p>
+          <w:p>
+            <w:r>
+              <w:t>-  Hiệu quả: nâng cấp bảo mật toàn bộ user mà không gián đoạn vận hành, không phiền nhân viên đổi password tay.</w:t>
+            </w:r>
+          </w:p>
+          <w:p>
+            <w:r>
+              <w:rPr>
+                <w:b/>
+              </w:rPr>
+              <w:t>Default date filter = hôm nay trên tất cả trang</w:t>
+            </w:r>
+          </w:p>
+          <w:p>
+            <w:r>
+              <w:t>-  Mở bất kỳ trang nào có bộ lọc ngày, mặc định chỉ hiện đơn/booking trong ngày — user tự đổi khi cần xem cũ hơn.</w:t>
+            </w:r>
+          </w:p>
+          <w:p>
+            <w:r>
+              <w:t>-  Hiệu quả: trang load nhanh hơn (ít dữ liệu), tập trung vào việc hôm nay, không lẫn lộn đơn cũ.</w:t>
+            </w:r>
+          </w:p>
+          <w:p>
+            <w:r>
+              <w:rPr>
+                <w:b/>
+              </w:rPr>
+              <w:t>App khách + app nội bộ Flutter signed riêng biệt</w:t>
+            </w:r>
+          </w:p>
+          <w:p>
+            <w:r>
+              <w:t>-  VCP Đặt Vé (khách, mở thẳng đặt vé không login) và app nội bộ (login + 3 tab Đặt Vé / Nhập Hàng / Tổng Hợp) — ký APK release riêng.</w:t>
+            </w:r>
+          </w:p>
+          <w:p>
+            <w:r>
+              <w:t>-  Hiệu quả: khách không thấy giao diện nội bộ, nhân viên có 1 app gọn 3 tab thay vì mở 3 trình duyệt, cài được trên máy thật ngoài Play Store.</w:t>
             </w:r>
           </w:p>
         </w:tc>

</xml_diff>